<commit_message>
fix: corrección cálculo payment Siigo
</commit_message>
<xml_diff>
--- a/access.docx
+++ b/access.docx
@@ -20,7 +20,7 @@
     <w:p>
       <w:r>
         <w:pict w14:anchorId="36789FE5">
-          <v:rect id="_x0000_i1037" style="width:0;height:1.5pt" o:hralign="center" o:hrstd="t" o:hr="t" fillcolor="#a0a0a0" stroked="f"/>
+          <v:rect id="_x0000_i1025" style="width:0;height:1.5pt" o:hralign="center" o:hrstd="t" o:hr="t" fillcolor="#a0a0a0" stroked="f"/>
         </w:pict>
       </w:r>
     </w:p>
@@ -85,7 +85,7 @@
     <w:p>
       <w:r>
         <w:pict w14:anchorId="4C9AD41B">
-          <v:rect id="_x0000_i1038" style="width:0;height:1.5pt" o:hralign="center" o:hrstd="t" o:hr="t" fillcolor="#a0a0a0" stroked="f"/>
+          <v:rect id="_x0000_i1026" style="width:0;height:1.5pt" o:hralign="center" o:hrstd="t" o:hr="t" fillcolor="#a0a0a0" stroked="f"/>
         </w:pict>
       </w:r>
     </w:p>
@@ -262,7 +262,7 @@
     <w:p>
       <w:r>
         <w:pict w14:anchorId="6A9C1112">
-          <v:rect id="_x0000_i1047" style="width:0;height:1.5pt" o:hralign="center" o:hrstd="t" o:hr="t" fillcolor="#a0a0a0" stroked="f"/>
+          <v:rect id="_x0000_i1027" style="width:0;height:1.5pt" o:hralign="center" o:hrstd="t" o:hr="t" fillcolor="#a0a0a0" stroked="f"/>
         </w:pict>
       </w:r>
     </w:p>
@@ -1681,15 +1681,7 @@
       </w:r>
       <w:proofErr w:type="spellEnd"/>
       <w:r>
-        <w:t xml:space="preserve"> </w:t>
-      </w:r>
-      <w:proofErr w:type="spellStart"/>
-      <w:r>
-        <w:t>not</w:t>
-      </w:r>
-      <w:proofErr w:type="spellEnd"/>
-      <w:r>
-        <w:t xml:space="preserve"> </w:t>
+        <w:t xml:space="preserve"> not </w:t>
       </w:r>
       <w:proofErr w:type="spellStart"/>
       <w:r>
@@ -3298,13 +3290,7 @@
       </w:r>
       <w:proofErr w:type="spellEnd"/>
       <w:r>
-        <w:t xml:space="preserve"> --global user.name "</w:t>
-      </w:r>
-      <w:r>
-        <w:t>administrativo-hash</w:t>
-      </w:r>
-      <w:r>
-        <w:t>"</w:t>
+        <w:t xml:space="preserve"> --global user.name "administrativo-hash"</w:t>
       </w:r>
     </w:p>
     <w:p>
@@ -4312,6 +4298,7 @@
   <w:style w:type="character" w:default="1" w:styleId="Fuentedeprrafopredeter">
     <w:name w:val="Default Paragraph Font"/>
     <w:uiPriority w:val="1"/>
+    <w:semiHidden/>
     <w:unhideWhenUsed/>
   </w:style>
   <w:style w:type="table" w:default="1" w:styleId="Tablanormal">

</xml_diff>

<commit_message>
fix: limpieza robusta XML + control errores parser
</commit_message>
<xml_diff>
--- a/access.docx
+++ b/access.docx
@@ -3231,145 +3231,6 @@
       <w:pPr>
         <w:spacing w:after="0"/>
       </w:pPr>
-    </w:p>
-    <w:p>
-      <w:pPr>
-        <w:spacing w:after="0"/>
-      </w:pPr>
-      <w:proofErr w:type="spellStart"/>
-      <w:r>
-        <w:t>git</w:t>
-      </w:r>
-      <w:proofErr w:type="spellEnd"/>
-      <w:r>
-        <w:t xml:space="preserve"> </w:t>
-      </w:r>
-      <w:proofErr w:type="spellStart"/>
-      <w:r>
-        <w:t>config</w:t>
-      </w:r>
-      <w:proofErr w:type="spellEnd"/>
-      <w:r>
-        <w:t xml:space="preserve"> --global </w:t>
-      </w:r>
-      <w:proofErr w:type="spellStart"/>
-      <w:proofErr w:type="gramStart"/>
-      <w:r>
-        <w:t>user.email</w:t>
-      </w:r>
-      <w:proofErr w:type="spellEnd"/>
-      <w:proofErr w:type="gramEnd"/>
-      <w:r>
-        <w:t xml:space="preserve"> "</w:t>
-      </w:r>
-      <w:proofErr w:type="spellStart"/>
-      <w:r>
-        <w:t>administrativo@crewwellness.club</w:t>
-      </w:r>
-      <w:proofErr w:type="spellEnd"/>
-      <w:r>
-        <w:t>"</w:t>
-      </w:r>
-    </w:p>
-    <w:p>
-      <w:pPr>
-        <w:spacing w:after="0"/>
-      </w:pPr>
-      <w:proofErr w:type="spellStart"/>
-      <w:r>
-        <w:lastRenderedPageBreak/>
-        <w:t>git</w:t>
-      </w:r>
-      <w:proofErr w:type="spellEnd"/>
-      <w:r>
-        <w:t xml:space="preserve"> </w:t>
-      </w:r>
-      <w:proofErr w:type="spellStart"/>
-      <w:r>
-        <w:t>config</w:t>
-      </w:r>
-      <w:proofErr w:type="spellEnd"/>
-      <w:r>
-        <w:t xml:space="preserve"> --global user.name "administrativo-hash"</w:t>
-      </w:r>
-    </w:p>
-    <w:p>
-      <w:pPr>
-        <w:spacing w:after="0"/>
-      </w:pPr>
-    </w:p>
-    <w:p>
-      <w:pPr>
-        <w:spacing w:after="0"/>
-      </w:pPr>
-    </w:p>
-    <w:p>
-      <w:pPr>
-        <w:spacing w:after="0"/>
-      </w:pPr>
-      <w:proofErr w:type="gramStart"/>
-      <w:r>
-        <w:t>código java</w:t>
-      </w:r>
-      <w:proofErr w:type="gramEnd"/>
-      <w:r>
-        <w:t xml:space="preserve"> </w:t>
-      </w:r>
-      <w:proofErr w:type="spellStart"/>
-      <w:r>
-        <w:t>detectarfacturas</w:t>
-      </w:r>
-      <w:proofErr w:type="spellEnd"/>
-      <w:r>
-        <w:t xml:space="preserve"> línea 10: </w:t>
-      </w:r>
-      <w:proofErr w:type="spellStart"/>
-      <w:r>
-        <w:t>if</w:t>
-      </w:r>
-      <w:proofErr w:type="spellEnd"/>
-      <w:r>
-        <w:t xml:space="preserve"> </w:t>
-      </w:r>
-      <w:proofErr w:type="gramStart"/>
-      <w:r>
-        <w:t>(!</w:t>
-      </w:r>
-      <w:proofErr w:type="spellStart"/>
-      <w:r>
-        <w:t>yaProcesado</w:t>
-      </w:r>
-      <w:proofErr w:type="spellEnd"/>
-      <w:proofErr w:type="gramEnd"/>
-      <w:r>
-        <w:t xml:space="preserve"> &amp;&amp; </w:t>
-      </w:r>
-      <w:proofErr w:type="spellStart"/>
-      <w:proofErr w:type="gramStart"/>
-      <w:r>
-        <w:t>archivo.getMimeType</w:t>
-      </w:r>
-      <w:proofErr w:type="spellEnd"/>
-      <w:proofErr w:type="gramEnd"/>
-      <w:r>
-        <w:t>() === "</w:t>
-      </w:r>
-      <w:proofErr w:type="spellStart"/>
-      <w:r>
-        <w:t>text</w:t>
-      </w:r>
-      <w:proofErr w:type="spellEnd"/>
-      <w:r>
-        <w:t>/</w:t>
-      </w:r>
-      <w:proofErr w:type="spellStart"/>
-      <w:r>
-        <w:t>xml</w:t>
-      </w:r>
-      <w:proofErr w:type="spellEnd"/>
-      <w:r>
-        <w:t>") {</w:t>
-      </w:r>
     </w:p>
     <w:p>
       <w:pPr>

</xml_diff>

<commit_message>
fix: token automático SIIGO, NIT sin DV, price = subtotal sin IVA
</commit_message>
<xml_diff>
--- a/access.docx
+++ b/access.docx
@@ -101,17 +101,8 @@
           <w:b/>
           <w:bCs/>
         </w:rPr>
-        <w:t xml:space="preserve">2. </w:t>
-      </w:r>
-      <w:proofErr w:type="spellStart"/>
-      <w:r>
-        <w:rPr>
-          <w:b/>
-          <w:bCs/>
-        </w:rPr>
-        <w:t>Headers</w:t>
-      </w:r>
-      <w:proofErr w:type="spellEnd"/>
+        <w:t>2. Headers</w:t>
+      </w:r>
     </w:p>
     <w:p>
       <w:r>
@@ -120,38 +111,12 @@
     </w:p>
     <w:p>
       <w:r>
-        <w:t>Content-</w:t>
-      </w:r>
-      <w:proofErr w:type="spellStart"/>
-      <w:r>
-        <w:t>Type</w:t>
-      </w:r>
-      <w:proofErr w:type="spellEnd"/>
-      <w:r>
-        <w:t xml:space="preserve">: </w:t>
-      </w:r>
-      <w:proofErr w:type="spellStart"/>
-      <w:r>
-        <w:t>application</w:t>
-      </w:r>
-      <w:proofErr w:type="spellEnd"/>
-      <w:r>
-        <w:t>/</w:t>
-      </w:r>
-      <w:proofErr w:type="spellStart"/>
-      <w:r>
-        <w:t>json</w:t>
-      </w:r>
-      <w:proofErr w:type="spellEnd"/>
+        <w:t>Content-Type: application/json</w:t>
+      </w:r>
       <w:r>
         <w:br/>
-        <w:t xml:space="preserve">Partner-Id: </w:t>
-      </w:r>
-      <w:proofErr w:type="spellStart"/>
-      <w:r>
-        <w:t>CrewWellnessAPI</w:t>
-      </w:r>
-      <w:proofErr w:type="spellEnd"/>
+        <w:t>Partner-Id: CrewWellnessAPI</w:t>
+      </w:r>
     </w:p>
     <w:p>
       <w:pPr>
@@ -174,35 +139,11 @@
       </w:r>
       <w:r>
         <w:br/>
-        <w:t xml:space="preserve">  "</w:t>
-      </w:r>
-      <w:proofErr w:type="spellStart"/>
-      <w:r>
-        <w:t>username</w:t>
-      </w:r>
-      <w:proofErr w:type="spellEnd"/>
-      <w:r>
-        <w:t>": "</w:t>
-      </w:r>
-      <w:proofErr w:type="spellStart"/>
-      <w:r>
-        <w:t>administrativo@crewwellness.club</w:t>
-      </w:r>
-      <w:proofErr w:type="spellEnd"/>
-      <w:r>
-        <w:t>",</w:t>
+        <w:t xml:space="preserve">  "username": "administrativo@crewwellness.club",</w:t>
       </w:r>
       <w:r>
         <w:br/>
-        <w:t xml:space="preserve">  "</w:t>
-      </w:r>
-      <w:proofErr w:type="spellStart"/>
-      <w:r>
-        <w:t>access_key</w:t>
-      </w:r>
-      <w:proofErr w:type="spellEnd"/>
-      <w:r>
-        <w:t>": "TU_ACCESS_KEY"</w:t>
+        <w:t xml:space="preserve">  "access_key": "TU_ACCESS_KEY"</w:t>
       </w:r>
       <w:r>
         <w:br/>
@@ -234,13 +175,8 @@
           <w:numId w:val="2"/>
         </w:numPr>
       </w:pPr>
-      <w:proofErr w:type="spellStart"/>
-      <w:r>
-        <w:t>username</w:t>
-      </w:r>
-      <w:proofErr w:type="spellEnd"/>
-      <w:r>
-        <w:t xml:space="preserve"> = el mismo que usaste antes </w:t>
+      <w:r>
+        <w:t xml:space="preserve">username = el mismo que usaste antes </w:t>
       </w:r>
     </w:p>
     <w:p>
@@ -250,13 +186,8 @@
           <w:numId w:val="2"/>
         </w:numPr>
       </w:pPr>
-      <w:proofErr w:type="spellStart"/>
-      <w:r>
-        <w:t>access_key</w:t>
-      </w:r>
-      <w:proofErr w:type="spellEnd"/>
-      <w:r>
-        <w:t xml:space="preserve"> = NO es el token, es la clave API de SIIGO </w:t>
+      <w:r>
+        <w:t xml:space="preserve">access_key = NO es el token, es la clave API de SIIGO </w:t>
       </w:r>
     </w:p>
     <w:p>
@@ -292,15 +223,7 @@
     <w:p>
       <w:r>
         <w:lastRenderedPageBreak/>
-        <w:t xml:space="preserve">    "</w:t>
-      </w:r>
-      <w:proofErr w:type="spellStart"/>
-      <w:r>
-        <w:t>access_token</w:t>
-      </w:r>
-      <w:proofErr w:type="spellEnd"/>
-      <w:r>
-        <w:t>": "</w:t>
+        <w:t xml:space="preserve">    "access_token": "</w:t>
       </w:r>
       <w:r>
         <w:t>eyJhbGciOiJSUzI1NiIsImtpZCI6IkM3QzFFQTY5M0FCMDREQTM5RkRBNTc3RDc4NTM0NEYxRkI5MDcwQzhSUzI1NiIsInR5cCI6ImF0K2p3dCIsIng1dCI6Ing4SHFhVHF3VGFPZjJsZDllRk5FOGZ1UWNNZyJ9.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.gfVWcgLvjhewDPcpGE9T8sCoRTFu3U4iui1TZrwRDy1JbvqncPI6KVqF6VPFIHMPGhOrXc5ftoykPLRDbXcRm0oVa24iu5A0zBjdtQ-YUcnTgDGyb84rKuys-XdYa3fWlPDCkA8RMr-uP3sEMxAaawnyuM1flQjETyY9tvxfcAnxPk3ZzxaE3iemiSMRkAKZPFrTG8kIx9FyxSeu7WqEAJEhvcx68CnkU93HSqyoumysHCs7kSjVev18Q09sGD2bGYaDDXuodSxdv-f8Igk01f2tbhtQKeiAO-MK1f1qNcsyu-wCWl3hPQy8rMUthDqf4BESzuq0Ur_0SAwJvGLAcg</w:t>
@@ -311,49 +234,17 @@
     </w:p>
     <w:p>
       <w:r>
-        <w:t xml:space="preserve">    "</w:t>
-      </w:r>
-      <w:proofErr w:type="spellStart"/>
-      <w:r>
-        <w:t>expires_in</w:t>
-      </w:r>
-      <w:proofErr w:type="spellEnd"/>
-      <w:r>
-        <w:t>": 86400,</w:t>
-      </w:r>
-    </w:p>
-    <w:p>
-      <w:r>
-        <w:t xml:space="preserve">    "</w:t>
-      </w:r>
-      <w:proofErr w:type="spellStart"/>
-      <w:r>
-        <w:t>token_type</w:t>
-      </w:r>
-      <w:proofErr w:type="spellEnd"/>
-      <w:r>
-        <w:t>": "Bearer",</w:t>
-      </w:r>
-    </w:p>
-    <w:p>
-      <w:r>
-        <w:t xml:space="preserve">    "</w:t>
-      </w:r>
-      <w:proofErr w:type="spellStart"/>
-      <w:r>
-        <w:t>scope</w:t>
-      </w:r>
-      <w:proofErr w:type="spellEnd"/>
-      <w:r>
-        <w:t>": "</w:t>
-      </w:r>
-      <w:proofErr w:type="spellStart"/>
-      <w:r>
-        <w:t>SiigoAPI</w:t>
-      </w:r>
-      <w:proofErr w:type="spellEnd"/>
-      <w:r>
-        <w:t>"</w:t>
+        <w:t xml:space="preserve">    "expires_in": 86400,</w:t>
+      </w:r>
+    </w:p>
+    <w:p>
+      <w:r>
+        <w:t xml:space="preserve">    "token_type": "Bearer",</w:t>
+      </w:r>
+    </w:p>
+    <w:p>
+      <w:r>
+        <w:t xml:space="preserve">    "scope": "SiigoAPI"</w:t>
       </w:r>
     </w:p>
     <w:p>
@@ -622,6 +513,47 @@
         <w:t>ND = Nota débito</w:t>
       </w:r>
     </w:p>
+    <w:p>
+      <w:pPr>
+        <w:rPr>
+          <w:b/>
+          <w:bCs/>
+        </w:rPr>
+      </w:pPr>
+    </w:p>
+    <w:p>
+      <w:r>
+        <w:rPr>
+          <w:b/>
+          <w:bCs/>
+        </w:rPr>
+        <w:t xml:space="preserve">MÉTODO GET PARA OBTENER </w:t>
+      </w:r>
+      <w:r>
+        <w:rPr>
+          <w:b/>
+          <w:bCs/>
+        </w:rPr>
+        <w:t>IMPUESTOS</w:t>
+      </w:r>
+      <w:r>
+        <w:rPr>
+          <w:b/>
+          <w:bCs/>
+        </w:rPr>
+        <w:t>:</w:t>
+      </w:r>
+    </w:p>
+    <w:p>
+      <w:hyperlink r:id="rId11" w:history="1">
+        <w:r>
+          <w:rPr>
+            <w:rStyle w:val="Hipervnculo"/>
+          </w:rPr>
+          <w:t>https://api.siigo.com/v1/taxes</w:t>
+        </w:r>
+      </w:hyperlink>
+    </w:p>
     <w:p/>
     <w:p>
       <w:pPr>
@@ -639,7 +571,7 @@
       </w:r>
     </w:p>
     <w:p>
-      <w:hyperlink r:id="rId11" w:history="1">
+      <w:hyperlink r:id="rId12" w:history="1">
         <w:r>
           <w:rPr>
             <w:rStyle w:val="Hipervnculo"/>
@@ -670,7 +602,7 @@
                     <pic:cNvPicPr/>
                   </pic:nvPicPr>
                   <pic:blipFill>
-                    <a:blip r:embed="rId12"/>
+                    <a:blip r:embed="rId13"/>
                     <a:stretch>
                       <a:fillRect/>
                     </a:stretch>
@@ -713,7 +645,7 @@
                     <pic:cNvPicPr/>
                   </pic:nvPicPr>
                   <pic:blipFill>
-                    <a:blip r:embed="rId13"/>
+                    <a:blip r:embed="rId14"/>
                     <a:stretch>
                       <a:fillRect/>
                     </a:stretch>
@@ -778,7 +710,7 @@
       <w:r>
         <w:br/>
       </w:r>
-      <w:hyperlink r:id="rId14" w:history="1">
+      <w:hyperlink r:id="rId15" w:history="1">
         <w:r>
           <w:rPr>
             <w:rStyle w:val="Hipervnculo"/>
@@ -806,32 +738,17 @@
       <w:pPr>
         <w:spacing w:after="0"/>
       </w:pPr>
-      <w:proofErr w:type="spellStart"/>
-      <w:r>
-        <w:t>Authorization</w:t>
-      </w:r>
-      <w:proofErr w:type="spellEnd"/>
-      <w:r>
-        <w:t xml:space="preserve"> → Bearer {token}</w:t>
-      </w:r>
-    </w:p>
-    <w:p>
-      <w:pPr>
-        <w:spacing w:after="0"/>
-      </w:pPr>
-      <w:proofErr w:type="spellStart"/>
-      <w:r>
-        <w:t>Username</w:t>
-      </w:r>
-      <w:proofErr w:type="spellEnd"/>
-      <w:r>
-        <w:t xml:space="preserve"> → </w:t>
-      </w:r>
-      <w:proofErr w:type="spellStart"/>
-      <w:r>
-        <w:t>administrativo@crewwellness.club</w:t>
-      </w:r>
-      <w:proofErr w:type="spellEnd"/>
+      <w:r>
+        <w:t>Authorization → Bearer {token}</w:t>
+      </w:r>
+    </w:p>
+    <w:p>
+      <w:pPr>
+        <w:spacing w:after="0"/>
+      </w:pPr>
+      <w:r>
+        <w:t>Username → administrativo@crewwellness.club</w:t>
+      </w:r>
     </w:p>
     <w:p>
       <w:pPr>
@@ -839,42 +756,16 @@
       </w:pPr>
       <w:r>
         <w:lastRenderedPageBreak/>
-        <w:t>Content-</w:t>
-      </w:r>
-      <w:proofErr w:type="spellStart"/>
-      <w:r>
-        <w:t>Type</w:t>
-      </w:r>
-      <w:proofErr w:type="spellEnd"/>
-      <w:r>
-        <w:t xml:space="preserve"> → </w:t>
-      </w:r>
-      <w:proofErr w:type="spellStart"/>
-      <w:r>
-        <w:t>application</w:t>
-      </w:r>
-      <w:proofErr w:type="spellEnd"/>
-      <w:r>
-        <w:t>/</w:t>
-      </w:r>
-      <w:proofErr w:type="spellStart"/>
-      <w:r>
-        <w:t>json</w:t>
-      </w:r>
-      <w:proofErr w:type="spellEnd"/>
-    </w:p>
-    <w:p>
-      <w:pPr>
-        <w:spacing w:after="0"/>
-      </w:pPr>
-      <w:r>
-        <w:t xml:space="preserve">Partner-Id → </w:t>
-      </w:r>
-      <w:proofErr w:type="spellStart"/>
-      <w:r>
-        <w:t>CrewWellnessAPI</w:t>
-      </w:r>
-      <w:proofErr w:type="spellEnd"/>
+        <w:t>Content-Type → application/json</w:t>
+      </w:r>
+    </w:p>
+    <w:p>
+      <w:pPr>
+        <w:spacing w:after="0"/>
+      </w:pPr>
+      <w:r>
+        <w:t>Partner-Id → CrewWellnessAPI</w:t>
+      </w:r>
     </w:p>
     <w:p/>
     <w:p>
@@ -905,15 +796,7 @@
         <w:spacing w:after="0"/>
       </w:pPr>
       <w:r>
-        <w:t xml:space="preserve">  "</w:t>
-      </w:r>
-      <w:proofErr w:type="spellStart"/>
-      <w:r>
-        <w:t>document</w:t>
-      </w:r>
-      <w:proofErr w:type="spellEnd"/>
-      <w:r>
-        <w:t>": {</w:t>
+        <w:t xml:space="preserve">  "document": {</w:t>
       </w:r>
     </w:p>
     <w:p>
@@ -945,47 +828,23 @@
         <w:spacing w:after="0"/>
       </w:pPr>
       <w:r>
-        <w:t xml:space="preserve">  "</w:t>
-      </w:r>
-      <w:proofErr w:type="spellStart"/>
-      <w:r>
-        <w:t>provider_invoice</w:t>
-      </w:r>
-      <w:proofErr w:type="spellEnd"/>
-      <w:r>
-        <w:t>": {</w:t>
-      </w:r>
-    </w:p>
-    <w:p>
-      <w:pPr>
-        <w:spacing w:after="0"/>
-      </w:pPr>
-      <w:r>
-        <w:t xml:space="preserve">    "</w:t>
-      </w:r>
-      <w:proofErr w:type="spellStart"/>
-      <w:r>
-        <w:t>prefix</w:t>
-      </w:r>
-      <w:proofErr w:type="spellEnd"/>
-      <w:r>
-        <w:t>": "FC",</w:t>
-      </w:r>
-    </w:p>
-    <w:p>
-      <w:pPr>
-        <w:spacing w:after="0"/>
-      </w:pPr>
-      <w:r>
-        <w:t xml:space="preserve">    "</w:t>
-      </w:r>
-      <w:proofErr w:type="spellStart"/>
-      <w:r>
-        <w:t>number</w:t>
-      </w:r>
-      <w:proofErr w:type="spellEnd"/>
-      <w:r>
-        <w:t>": 1</w:t>
+        <w:t xml:space="preserve">  "provider_invoice": {</w:t>
+      </w:r>
+    </w:p>
+    <w:p>
+      <w:pPr>
+        <w:spacing w:after="0"/>
+      </w:pPr>
+      <w:r>
+        <w:t xml:space="preserve">    "prefix": "FC",</w:t>
+      </w:r>
+    </w:p>
+    <w:p>
+      <w:pPr>
+        <w:spacing w:after="0"/>
+      </w:pPr>
+      <w:r>
+        <w:t xml:space="preserve">    "number": 1</w:t>
       </w:r>
     </w:p>
     <w:p>
@@ -1001,31 +860,15 @@
         <w:spacing w:after="0"/>
       </w:pPr>
       <w:r>
-        <w:t xml:space="preserve">  "</w:t>
-      </w:r>
-      <w:proofErr w:type="spellStart"/>
-      <w:r>
-        <w:t>supplier</w:t>
-      </w:r>
-      <w:proofErr w:type="spellEnd"/>
-      <w:r>
-        <w:t>": {</w:t>
-      </w:r>
-    </w:p>
-    <w:p>
-      <w:pPr>
-        <w:spacing w:after="0"/>
-      </w:pPr>
-      <w:r>
-        <w:t xml:space="preserve">    "</w:t>
-      </w:r>
-      <w:proofErr w:type="spellStart"/>
-      <w:r>
-        <w:t>identification</w:t>
-      </w:r>
-      <w:proofErr w:type="spellEnd"/>
-      <w:r>
-        <w:t>": "901570731"</w:t>
+        <w:t xml:space="preserve">  "supplier": {</w:t>
+      </w:r>
+    </w:p>
+    <w:p>
+      <w:pPr>
+        <w:spacing w:after="0"/>
+      </w:pPr>
+      <w:r>
+        <w:t xml:space="preserve">    "identification": "901570731"</w:t>
       </w:r>
     </w:p>
     <w:p>
@@ -1041,31 +884,15 @@
         <w:spacing w:after="0"/>
       </w:pPr>
       <w:r>
-        <w:t xml:space="preserve">  "</w:t>
-      </w:r>
-      <w:proofErr w:type="spellStart"/>
-      <w:r>
-        <w:t>cost_center</w:t>
-      </w:r>
-      <w:proofErr w:type="spellEnd"/>
-      <w:r>
-        <w:t>": 1132,</w:t>
-      </w:r>
-    </w:p>
-    <w:p>
-      <w:pPr>
-        <w:spacing w:after="0"/>
-      </w:pPr>
-      <w:r>
-        <w:t xml:space="preserve">  "</w:t>
-      </w:r>
-      <w:proofErr w:type="spellStart"/>
-      <w:r>
-        <w:t>items</w:t>
-      </w:r>
-      <w:proofErr w:type="spellEnd"/>
-      <w:r>
-        <w:t>": [</w:t>
+        <w:t xml:space="preserve">  "cost_center": 1132,</w:t>
+      </w:r>
+    </w:p>
+    <w:p>
+      <w:pPr>
+        <w:spacing w:after="0"/>
+      </w:pPr>
+      <w:r>
+        <w:t xml:space="preserve">  "items": [</w:t>
       </w:r>
     </w:p>
     <w:p>
@@ -1081,87 +908,39 @@
         <w:spacing w:after="0"/>
       </w:pPr>
       <w:r>
-        <w:t xml:space="preserve">      "</w:t>
-      </w:r>
-      <w:proofErr w:type="spellStart"/>
-      <w:r>
-        <w:t>code</w:t>
-      </w:r>
-      <w:proofErr w:type="spellEnd"/>
-      <w:r>
-        <w:t>": "72057201",</w:t>
-      </w:r>
-    </w:p>
-    <w:p>
-      <w:pPr>
-        <w:spacing w:after="0"/>
-      </w:pPr>
-      <w:r>
-        <w:t xml:space="preserve">      "</w:t>
-      </w:r>
-      <w:proofErr w:type="spellStart"/>
-      <w:r>
-        <w:t>description</w:t>
-      </w:r>
-      <w:proofErr w:type="spellEnd"/>
-      <w:r>
-        <w:t>": "Servicio de prueba API",</w:t>
-      </w:r>
-    </w:p>
-    <w:p>
-      <w:pPr>
-        <w:spacing w:after="0"/>
-      </w:pPr>
-      <w:r>
-        <w:t xml:space="preserve">      "</w:t>
-      </w:r>
-      <w:proofErr w:type="spellStart"/>
-      <w:r>
-        <w:t>quantity</w:t>
-      </w:r>
-      <w:proofErr w:type="spellEnd"/>
-      <w:r>
-        <w:t>": 1,</w:t>
-      </w:r>
-    </w:p>
-    <w:p>
-      <w:pPr>
-        <w:spacing w:after="0"/>
-      </w:pPr>
-      <w:r>
-        <w:t xml:space="preserve">      "</w:t>
-      </w:r>
-      <w:proofErr w:type="spellStart"/>
-      <w:r>
-        <w:t>price</w:t>
-      </w:r>
-      <w:proofErr w:type="spellEnd"/>
-      <w:r>
-        <w:t>": 100000,</w:t>
-      </w:r>
-    </w:p>
-    <w:p>
-      <w:pPr>
-        <w:spacing w:after="0"/>
-      </w:pPr>
-      <w:r>
-        <w:t xml:space="preserve">      "</w:t>
-      </w:r>
-      <w:proofErr w:type="spellStart"/>
-      <w:r>
-        <w:t>type</w:t>
-      </w:r>
-      <w:proofErr w:type="spellEnd"/>
-      <w:r>
-        <w:t>": "</w:t>
-      </w:r>
-      <w:proofErr w:type="spellStart"/>
-      <w:r>
-        <w:t>Account</w:t>
-      </w:r>
-      <w:proofErr w:type="spellEnd"/>
-      <w:r>
-        <w:t>"</w:t>
+        <w:t xml:space="preserve">      "code": "72057201",</w:t>
+      </w:r>
+    </w:p>
+    <w:p>
+      <w:pPr>
+        <w:spacing w:after="0"/>
+      </w:pPr>
+      <w:r>
+        <w:t xml:space="preserve">      "description": "Servicio de prueba API",</w:t>
+      </w:r>
+    </w:p>
+    <w:p>
+      <w:pPr>
+        <w:spacing w:after="0"/>
+      </w:pPr>
+      <w:r>
+        <w:t xml:space="preserve">      "quantity": 1,</w:t>
+      </w:r>
+    </w:p>
+    <w:p>
+      <w:pPr>
+        <w:spacing w:after="0"/>
+      </w:pPr>
+      <w:r>
+        <w:t xml:space="preserve">      "price": 100000,</w:t>
+      </w:r>
+    </w:p>
+    <w:p>
+      <w:pPr>
+        <w:spacing w:after="0"/>
+      </w:pPr>
+      <w:r>
+        <w:t xml:space="preserve">      "type": "Account"</w:t>
       </w:r>
     </w:p>
     <w:p>
@@ -1185,15 +964,7 @@
         <w:spacing w:after="0"/>
       </w:pPr>
       <w:r>
-        <w:t xml:space="preserve">  "</w:t>
-      </w:r>
-      <w:proofErr w:type="spellStart"/>
-      <w:r>
-        <w:t>payments</w:t>
-      </w:r>
-      <w:proofErr w:type="spellEnd"/>
-      <w:r>
-        <w:t>": [</w:t>
+        <w:t xml:space="preserve">  "payments": [</w:t>
       </w:r>
     </w:p>
     <w:p>
@@ -1217,31 +988,15 @@
         <w:spacing w:after="0"/>
       </w:pPr>
       <w:r>
-        <w:t xml:space="preserve">    "</w:t>
-      </w:r>
-      <w:proofErr w:type="spellStart"/>
-      <w:r>
-        <w:t>value</w:t>
-      </w:r>
-      <w:proofErr w:type="spellEnd"/>
-      <w:r>
-        <w:t>": 100000,</w:t>
-      </w:r>
-    </w:p>
-    <w:p>
-      <w:pPr>
-        <w:spacing w:after="0"/>
-      </w:pPr>
-      <w:r>
-        <w:t xml:space="preserve">    "</w:t>
-      </w:r>
-      <w:proofErr w:type="spellStart"/>
-      <w:r>
-        <w:t>due_date</w:t>
-      </w:r>
-      <w:proofErr w:type="spellEnd"/>
-      <w:r>
-        <w:t>": "2026-03-20"</w:t>
+        <w:t xml:space="preserve">    "value": 100000,</w:t>
+      </w:r>
+    </w:p>
+    <w:p>
+      <w:pPr>
+        <w:spacing w:after="0"/>
+      </w:pPr>
+      <w:r>
+        <w:t xml:space="preserve">    "due_date": "2026-03-20"</w:t>
       </w:r>
     </w:p>
     <w:p>
@@ -1293,40 +1048,17 @@
       <w:pPr>
         <w:spacing w:after="0"/>
       </w:pPr>
-      <w:proofErr w:type="spellStart"/>
       <w:r>
         <w:lastRenderedPageBreak/>
-        <w:t>import</w:t>
-      </w:r>
-      <w:proofErr w:type="spellEnd"/>
-      <w:r>
-        <w:t xml:space="preserve"> re</w:t>
-      </w:r>
-    </w:p>
-    <w:p>
-      <w:pPr>
-        <w:spacing w:after="0"/>
-      </w:pPr>
-      <w:proofErr w:type="spellStart"/>
-      <w:r>
-        <w:t>import</w:t>
-      </w:r>
-      <w:proofErr w:type="spellEnd"/>
-      <w:r>
-        <w:t xml:space="preserve"> </w:t>
-      </w:r>
-      <w:proofErr w:type="spellStart"/>
-      <w:proofErr w:type="gramStart"/>
-      <w:r>
-        <w:t>xml.etree</w:t>
-      </w:r>
-      <w:proofErr w:type="gramEnd"/>
-      <w:r>
-        <w:t>.ElementTree</w:t>
-      </w:r>
-      <w:proofErr w:type="spellEnd"/>
-      <w:r>
-        <w:t xml:space="preserve"> as ET</w:t>
+        <w:t>import re</w:t>
+      </w:r>
+    </w:p>
+    <w:p>
+      <w:pPr>
+        <w:spacing w:after="0"/>
+      </w:pPr>
+      <w:r>
+        <w:t>import xml.etree.ElementTree as ET</w:t>
       </w:r>
     </w:p>
     <w:p>
@@ -1347,95 +1079,15 @@
         <w:spacing w:after="0"/>
       </w:pPr>
       <w:r>
-        <w:t>    '</w:t>
-      </w:r>
-      <w:proofErr w:type="spellStart"/>
-      <w:r>
-        <w:t>cbc</w:t>
-      </w:r>
-      <w:proofErr w:type="spellEnd"/>
-      <w:r>
-        <w:t>': '</w:t>
-      </w:r>
-      <w:proofErr w:type="gramStart"/>
-      <w:r>
-        <w:t>urn:oasis</w:t>
-      </w:r>
-      <w:proofErr w:type="gramEnd"/>
-      <w:r>
-        <w:t>:</w:t>
-      </w:r>
-      <w:proofErr w:type="gramStart"/>
-      <w:r>
-        <w:t>names:specification</w:t>
-      </w:r>
-      <w:proofErr w:type="gramEnd"/>
-      <w:r>
-        <w:t>:</w:t>
-      </w:r>
-      <w:proofErr w:type="gramStart"/>
-      <w:r>
-        <w:t>ubl:schema</w:t>
-      </w:r>
-      <w:proofErr w:type="gramEnd"/>
-      <w:r>
-        <w:t>:</w:t>
-      </w:r>
-      <w:proofErr w:type="gramStart"/>
-      <w:r>
-        <w:t>xsd:CommonBasicComponents</w:t>
-      </w:r>
-      <w:proofErr w:type="gramEnd"/>
-      <w:r>
-        <w:t>-2',</w:t>
-      </w:r>
-    </w:p>
-    <w:p>
-      <w:pPr>
-        <w:spacing w:after="0"/>
-      </w:pPr>
-      <w:r>
-        <w:t>    '</w:t>
-      </w:r>
-      <w:proofErr w:type="spellStart"/>
-      <w:r>
-        <w:t>cac</w:t>
-      </w:r>
-      <w:proofErr w:type="spellEnd"/>
-      <w:r>
-        <w:t>': '</w:t>
-      </w:r>
-      <w:proofErr w:type="gramStart"/>
-      <w:r>
-        <w:t>urn:oasis</w:t>
-      </w:r>
-      <w:proofErr w:type="gramEnd"/>
-      <w:r>
-        <w:t>:</w:t>
-      </w:r>
-      <w:proofErr w:type="gramStart"/>
-      <w:r>
-        <w:t>names:specification</w:t>
-      </w:r>
-      <w:proofErr w:type="gramEnd"/>
-      <w:r>
-        <w:t>:</w:t>
-      </w:r>
-      <w:proofErr w:type="gramStart"/>
-      <w:r>
-        <w:t>ubl:schema</w:t>
-      </w:r>
-      <w:proofErr w:type="gramEnd"/>
-      <w:r>
-        <w:t>:</w:t>
-      </w:r>
-      <w:proofErr w:type="gramStart"/>
-      <w:r>
-        <w:t>xsd:CommonAggregateComponents</w:t>
-      </w:r>
-      <w:proofErr w:type="gramEnd"/>
-      <w:r>
-        <w:t>-2',</w:t>
+        <w:t>    'cbc': 'urn:oasis:names:specification:ubl:schema:xsd:CommonBasicComponents-2',</w:t>
+      </w:r>
+    </w:p>
+    <w:p>
+      <w:pPr>
+        <w:spacing w:after="0"/>
+      </w:pPr>
+      <w:r>
+        <w:t>    'cac': 'urn:oasis:names:specification:ubl:schema:xsd:CommonAggregateComponents-2',</w:t>
       </w:r>
     </w:p>
     <w:p>
@@ -1455,50 +1107,8 @@
       <w:pPr>
         <w:spacing w:after="0"/>
       </w:pPr>
-      <w:proofErr w:type="spellStart"/>
-      <w:r>
-        <w:t>def</w:t>
-      </w:r>
-      <w:proofErr w:type="spellEnd"/>
-      <w:r>
-        <w:t xml:space="preserve"> </w:t>
-      </w:r>
-      <w:proofErr w:type="spellStart"/>
-      <w:r>
-        <w:t>parsear_factura_</w:t>
-      </w:r>
-      <w:proofErr w:type="gramStart"/>
-      <w:r>
-        <w:t>xml</w:t>
-      </w:r>
-      <w:proofErr w:type="spellEnd"/>
-      <w:r>
-        <w:t>(</w:t>
-      </w:r>
-      <w:proofErr w:type="spellStart"/>
-      <w:proofErr w:type="gramEnd"/>
-      <w:r>
-        <w:t>xml_string</w:t>
-      </w:r>
-      <w:proofErr w:type="spellEnd"/>
-      <w:r>
-        <w:t xml:space="preserve">: </w:t>
-      </w:r>
-      <w:proofErr w:type="spellStart"/>
-      <w:r>
-        <w:t>str</w:t>
-      </w:r>
-      <w:proofErr w:type="spellEnd"/>
-      <w:r>
-        <w:t xml:space="preserve">) -&gt; </w:t>
-      </w:r>
-      <w:proofErr w:type="spellStart"/>
-      <w:r>
-        <w:t>dict</w:t>
-      </w:r>
-      <w:proofErr w:type="spellEnd"/>
-      <w:r>
-        <w:t>:</w:t>
+      <w:r>
+        <w:t>def parsear_factura_xml(xml_string: str) -&gt; dict:</w:t>
       </w:r>
     </w:p>
     <w:p>
@@ -1514,39 +1124,15 @@
         <w:spacing w:after="0"/>
       </w:pPr>
       <w:r>
-        <w:t xml:space="preserve">    Recibe el contenido XML como </w:t>
-      </w:r>
-      <w:proofErr w:type="spellStart"/>
-      <w:r>
-        <w:t>string</w:t>
-      </w:r>
-      <w:proofErr w:type="spellEnd"/>
-      <w:r>
-        <w:t xml:space="preserve"> (</w:t>
-      </w:r>
-      <w:proofErr w:type="spellStart"/>
-      <w:r>
-        <w:t>AttachedDocument</w:t>
-      </w:r>
-      <w:proofErr w:type="spellEnd"/>
-      <w:r>
-        <w:t xml:space="preserve"> colombiano UBL 2.1).</w:t>
-      </w:r>
-    </w:p>
-    <w:p>
-      <w:pPr>
-        <w:spacing w:after="0"/>
-      </w:pPr>
-      <w:r>
-        <w:t xml:space="preserve">    Retorna un </w:t>
-      </w:r>
-      <w:proofErr w:type="spellStart"/>
-      <w:r>
-        <w:t>dict</w:t>
-      </w:r>
-      <w:proofErr w:type="spellEnd"/>
-      <w:r>
-        <w:t xml:space="preserve"> con todos los datos necesarios para SIIGO.</w:t>
+        <w:t>    Recibe el contenido XML como string (AttachedDocument colombiano UBL 2.1).</w:t>
+      </w:r>
+    </w:p>
+    <w:p>
+      <w:pPr>
+        <w:spacing w:after="0"/>
+      </w:pPr>
+      <w:r>
+        <w:t>    Retorna un dict con todos los datos necesarios para SIIGO.</w:t>
       </w:r>
     </w:p>
     <w:p>
@@ -1562,15 +1148,61 @@
         <w:spacing w:after="0"/>
       </w:pPr>
       <w:r>
-        <w:t xml:space="preserve">    # PASO 1: Extraer </w:t>
-      </w:r>
-      <w:proofErr w:type="spellStart"/>
-      <w:r>
-        <w:t>Invoice</w:t>
-      </w:r>
-      <w:proofErr w:type="spellEnd"/>
-      <w:r>
-        <w:t xml:space="preserve"> del CDATA</w:t>
+        <w:t>    # PASO 1: Extraer Invoice del CDATA</w:t>
+      </w:r>
+    </w:p>
+    <w:p>
+      <w:pPr>
+        <w:spacing w:after="0"/>
+      </w:pPr>
+      <w:r>
+        <w:t>    cdata_match = re.search(r'&lt;!</w:t>
+      </w:r>
+      <w:r>
+        <w:rPr>
+          <w:b/>
+          <w:bCs/>
+        </w:rPr>
+        <w:t>\[</w:t>
+      </w:r>
+      <w:r>
+        <w:t>CDATA</w:t>
+      </w:r>
+      <w:r>
+        <w:rPr>
+          <w:b/>
+          <w:bCs/>
+        </w:rPr>
+        <w:t>\[</w:t>
+      </w:r>
+      <w:r>
+        <w:t>(.*?)</w:t>
+      </w:r>
+      <w:r>
+        <w:rPr>
+          <w:b/>
+          <w:bCs/>
+        </w:rPr>
+        <w:t>\]\]</w:t>
+      </w:r>
+      <w:r>
+        <w:t>&gt;', xml_string, re.DOTALL)</w:t>
+      </w:r>
+    </w:p>
+    <w:p>
+      <w:pPr>
+        <w:spacing w:after="0"/>
+      </w:pPr>
+      <w:r>
+        <w:t>    if not cdata_match:</w:t>
+      </w:r>
+    </w:p>
+    <w:p>
+      <w:pPr>
+        <w:spacing w:after="0"/>
+      </w:pPr>
+      <w:r>
+        <w:t>        raise ValueError("No se encontró CDATA con Invoice embebida")</w:t>
       </w:r>
     </w:p>
     <w:p>
@@ -1580,313 +1212,42 @@
       <w:r>
         <w:t xml:space="preserve">    </w:t>
       </w:r>
-      <w:proofErr w:type="spellStart"/>
-      <w:r>
-        <w:t>cdata_match</w:t>
-      </w:r>
-      <w:proofErr w:type="spellEnd"/>
-      <w:r>
-        <w:t xml:space="preserve"> = </w:t>
-      </w:r>
-      <w:proofErr w:type="spellStart"/>
-      <w:proofErr w:type="gramStart"/>
-      <w:r>
-        <w:t>re.search</w:t>
-      </w:r>
-      <w:proofErr w:type="spellEnd"/>
-      <w:proofErr w:type="gramEnd"/>
-      <w:r>
-        <w:t>(r'</w:t>
-      </w:r>
-      <w:proofErr w:type="gramStart"/>
-      <w:r>
-        <w:t>&lt;!</w:t>
-      </w:r>
-      <w:r>
-        <w:rPr>
-          <w:b/>
-          <w:bCs/>
-        </w:rPr>
-        <w:t>\</w:t>
-      </w:r>
-      <w:proofErr w:type="gramEnd"/>
-      <w:r>
-        <w:rPr>
-          <w:b/>
-          <w:bCs/>
-        </w:rPr>
-        <w:t>[</w:t>
-      </w:r>
-      <w:r>
-        <w:t>CDATA</w:t>
-      </w:r>
-      <w:proofErr w:type="gramStart"/>
-      <w:r>
-        <w:rPr>
-          <w:b/>
-          <w:bCs/>
-        </w:rPr>
-        <w:t>\[</w:t>
-      </w:r>
-      <w:r>
-        <w:t>(.*?)</w:t>
-      </w:r>
-      <w:r>
-        <w:rPr>
-          <w:b/>
-          <w:bCs/>
-        </w:rPr>
-        <w:t>\</w:t>
-      </w:r>
-      <w:proofErr w:type="gramEnd"/>
-      <w:r>
-        <w:rPr>
-          <w:b/>
-          <w:bCs/>
-        </w:rPr>
-        <w:t>]\]</w:t>
-      </w:r>
-      <w:r>
-        <w:t xml:space="preserve">&gt;', </w:t>
-      </w:r>
-      <w:proofErr w:type="spellStart"/>
-      <w:r>
-        <w:t>xml_string</w:t>
-      </w:r>
-      <w:proofErr w:type="spellEnd"/>
-      <w:r>
-        <w:t xml:space="preserve">, </w:t>
-      </w:r>
-      <w:proofErr w:type="spellStart"/>
-      <w:proofErr w:type="gramStart"/>
-      <w:r>
-        <w:t>re.DOTALL</w:t>
-      </w:r>
-      <w:proofErr w:type="spellEnd"/>
-      <w:proofErr w:type="gramEnd"/>
-      <w:r>
-        <w:t>)</w:t>
-      </w:r>
-    </w:p>
-    <w:p>
-      <w:pPr>
-        <w:spacing w:after="0"/>
-      </w:pPr>
-      <w:r>
-        <w:t xml:space="preserve">    </w:t>
-      </w:r>
-      <w:proofErr w:type="spellStart"/>
-      <w:r>
-        <w:t>if</w:t>
-      </w:r>
-      <w:proofErr w:type="spellEnd"/>
-      <w:r>
-        <w:t xml:space="preserve"> not </w:t>
-      </w:r>
-      <w:proofErr w:type="spellStart"/>
-      <w:r>
-        <w:t>cdata_match</w:t>
-      </w:r>
-      <w:proofErr w:type="spellEnd"/>
-      <w:r>
-        <w:t>:</w:t>
-      </w:r>
-    </w:p>
-    <w:p>
-      <w:pPr>
-        <w:spacing w:after="0"/>
-      </w:pPr>
-      <w:r>
-        <w:t xml:space="preserve">        </w:t>
-      </w:r>
-      <w:proofErr w:type="spellStart"/>
-      <w:r>
-        <w:t>raise</w:t>
-      </w:r>
-      <w:proofErr w:type="spellEnd"/>
-      <w:r>
-        <w:t xml:space="preserve"> </w:t>
-      </w:r>
-      <w:proofErr w:type="spellStart"/>
-      <w:proofErr w:type="gramStart"/>
-      <w:r>
-        <w:t>ValueError</w:t>
-      </w:r>
-      <w:proofErr w:type="spellEnd"/>
-      <w:r>
-        <w:t>(</w:t>
-      </w:r>
-      <w:proofErr w:type="gramEnd"/>
-      <w:r>
-        <w:t xml:space="preserve">"No se encontró CDATA con </w:t>
-      </w:r>
-      <w:proofErr w:type="spellStart"/>
-      <w:r>
-        <w:t>Invoice</w:t>
-      </w:r>
-      <w:proofErr w:type="spellEnd"/>
-      <w:r>
-        <w:t xml:space="preserve"> embebida")</w:t>
-      </w:r>
-    </w:p>
-    <w:p>
-      <w:pPr>
-        <w:spacing w:after="0"/>
-      </w:pPr>
-      <w:r>
-        <w:t xml:space="preserve">    </w:t>
-      </w:r>
-    </w:p>
-    <w:p>
-      <w:pPr>
-        <w:spacing w:after="0"/>
-      </w:pPr>
-      <w:r>
-        <w:t xml:space="preserve">    </w:t>
-      </w:r>
-      <w:proofErr w:type="spellStart"/>
-      <w:r>
-        <w:t>invoice_xml</w:t>
-      </w:r>
-      <w:proofErr w:type="spellEnd"/>
-      <w:r>
-        <w:t xml:space="preserve"> = </w:t>
-      </w:r>
-      <w:proofErr w:type="spellStart"/>
-      <w:r>
-        <w:t>cdata_</w:t>
-      </w:r>
-      <w:proofErr w:type="gramStart"/>
-      <w:r>
-        <w:t>match.group</w:t>
-      </w:r>
-      <w:proofErr w:type="spellEnd"/>
-      <w:proofErr w:type="gramEnd"/>
-      <w:r>
-        <w:t>(1)</w:t>
-      </w:r>
-    </w:p>
-    <w:p>
-      <w:pPr>
-        <w:spacing w:after="0"/>
-      </w:pPr>
-      <w:r>
-        <w:t xml:space="preserve">    </w:t>
-      </w:r>
-      <w:proofErr w:type="spellStart"/>
-      <w:r>
-        <w:t>root</w:t>
-      </w:r>
-      <w:proofErr w:type="spellEnd"/>
-      <w:r>
-        <w:t xml:space="preserve"> = </w:t>
-      </w:r>
-      <w:proofErr w:type="spellStart"/>
-      <w:proofErr w:type="gramStart"/>
-      <w:r>
-        <w:t>ET.fromstring</w:t>
-      </w:r>
-      <w:proofErr w:type="spellEnd"/>
-      <w:proofErr w:type="gramEnd"/>
-      <w:r>
-        <w:t>(</w:t>
-      </w:r>
-      <w:proofErr w:type="spellStart"/>
-      <w:r>
-        <w:t>invoice_xml</w:t>
-      </w:r>
-      <w:proofErr w:type="spellEnd"/>
-      <w:r>
-        <w:t>)</w:t>
-      </w:r>
-    </w:p>
-    <w:p>
-      <w:pPr>
-        <w:spacing w:after="0"/>
-      </w:pPr>
-    </w:p>
-    <w:p>
-      <w:pPr>
-        <w:spacing w:after="0"/>
-      </w:pPr>
-      <w:r>
-        <w:t xml:space="preserve">    </w:t>
-      </w:r>
-      <w:proofErr w:type="spellStart"/>
-      <w:r>
-        <w:t>def</w:t>
-      </w:r>
-      <w:proofErr w:type="spellEnd"/>
-      <w:r>
-        <w:t xml:space="preserve"> </w:t>
-      </w:r>
-      <w:proofErr w:type="spellStart"/>
-      <w:proofErr w:type="gramStart"/>
-      <w:r>
-        <w:t>txt</w:t>
-      </w:r>
-      <w:proofErr w:type="spellEnd"/>
-      <w:r>
-        <w:t>(</w:t>
-      </w:r>
-      <w:proofErr w:type="spellStart"/>
-      <w:proofErr w:type="gramEnd"/>
-      <w:r>
-        <w:t>element</w:t>
-      </w:r>
-      <w:proofErr w:type="spellEnd"/>
-      <w:r>
-        <w:t xml:space="preserve">, </w:t>
-      </w:r>
-      <w:proofErr w:type="spellStart"/>
-      <w:r>
-        <w:t>path</w:t>
-      </w:r>
-      <w:proofErr w:type="spellEnd"/>
-      <w:r>
-        <w:t>):</w:t>
-      </w:r>
-    </w:p>
-    <w:p>
-      <w:pPr>
-        <w:spacing w:after="0"/>
-      </w:pPr>
-      <w:r>
-        <w:t xml:space="preserve">        </w:t>
-      </w:r>
-      <w:proofErr w:type="spellStart"/>
-      <w:r>
-        <w:t>return</w:t>
-      </w:r>
-      <w:proofErr w:type="spellEnd"/>
-      <w:r>
-        <w:t xml:space="preserve"> </w:t>
-      </w:r>
-      <w:proofErr w:type="spellStart"/>
-      <w:proofErr w:type="gramStart"/>
-      <w:r>
-        <w:t>element.findtext</w:t>
-      </w:r>
-      <w:proofErr w:type="spellEnd"/>
-      <w:proofErr w:type="gramEnd"/>
-      <w:r>
-        <w:t>(</w:t>
-      </w:r>
-      <w:proofErr w:type="spellStart"/>
-      <w:r>
-        <w:t>path</w:t>
-      </w:r>
-      <w:proofErr w:type="spellEnd"/>
-      <w:r>
-        <w:t xml:space="preserve">, </w:t>
-      </w:r>
-      <w:proofErr w:type="spellStart"/>
-      <w:r>
-        <w:t>namespaces</w:t>
-      </w:r>
-      <w:proofErr w:type="spellEnd"/>
-      <w:r>
-        <w:t>=NS)</w:t>
+    </w:p>
+    <w:p>
+      <w:pPr>
+        <w:spacing w:after="0"/>
+      </w:pPr>
+      <w:r>
+        <w:t>    invoice_xml = cdata_match.group(1)</w:t>
+      </w:r>
+    </w:p>
+    <w:p>
+      <w:pPr>
+        <w:spacing w:after="0"/>
+      </w:pPr>
+      <w:r>
+        <w:t>    root = ET.fromstring(invoice_xml)</w:t>
+      </w:r>
+    </w:p>
+    <w:p>
+      <w:pPr>
+        <w:spacing w:after="0"/>
+      </w:pPr>
+    </w:p>
+    <w:p>
+      <w:pPr>
+        <w:spacing w:after="0"/>
+      </w:pPr>
+      <w:r>
+        <w:t>    def txt(element, path):</w:t>
+      </w:r>
+    </w:p>
+    <w:p>
+      <w:pPr>
+        <w:spacing w:after="0"/>
+      </w:pPr>
+      <w:r>
+        <w:t>        return element.findtext(path, namespaces=NS)</w:t>
       </w:r>
     </w:p>
     <w:p>
@@ -1907,132 +1268,23 @@
         <w:spacing w:after="0"/>
       </w:pPr>
       <w:r>
-        <w:t xml:space="preserve">    numero = </w:t>
-      </w:r>
-      <w:proofErr w:type="spellStart"/>
-      <w:proofErr w:type="gramStart"/>
-      <w:r>
-        <w:t>txt</w:t>
-      </w:r>
-      <w:proofErr w:type="spellEnd"/>
-      <w:r>
-        <w:t>(</w:t>
-      </w:r>
-      <w:proofErr w:type="spellStart"/>
-      <w:proofErr w:type="gramEnd"/>
-      <w:r>
-        <w:t>root</w:t>
-      </w:r>
-      <w:proofErr w:type="spellEnd"/>
-      <w:r>
-        <w:t xml:space="preserve">, </w:t>
-      </w:r>
-      <w:proofErr w:type="gramStart"/>
-      <w:r>
-        <w:t>'./</w:t>
-      </w:r>
-      <w:proofErr w:type="gramEnd"/>
-      <w:r>
-        <w:t>/</w:t>
-      </w:r>
-      <w:proofErr w:type="spellStart"/>
-      <w:r>
-        <w:t>cbc:ID</w:t>
-      </w:r>
-      <w:proofErr w:type="spellEnd"/>
-      <w:r>
-        <w:t>')</w:t>
-      </w:r>
-    </w:p>
-    <w:p>
-      <w:pPr>
-        <w:spacing w:after="0"/>
-      </w:pPr>
-      <w:r>
-        <w:t xml:space="preserve">    fecha = </w:t>
-      </w:r>
-      <w:proofErr w:type="spellStart"/>
-      <w:proofErr w:type="gramStart"/>
-      <w:r>
-        <w:t>txt</w:t>
-      </w:r>
-      <w:proofErr w:type="spellEnd"/>
-      <w:r>
-        <w:t>(</w:t>
-      </w:r>
-      <w:proofErr w:type="spellStart"/>
-      <w:proofErr w:type="gramEnd"/>
-      <w:r>
-        <w:t>root</w:t>
-      </w:r>
-      <w:proofErr w:type="spellEnd"/>
-      <w:r>
-        <w:t xml:space="preserve">, </w:t>
-      </w:r>
-      <w:proofErr w:type="gramStart"/>
-      <w:r>
-        <w:t>'./</w:t>
-      </w:r>
-      <w:proofErr w:type="gramEnd"/>
-      <w:r>
-        <w:t>/</w:t>
-      </w:r>
-      <w:proofErr w:type="spellStart"/>
-      <w:proofErr w:type="gramStart"/>
-      <w:r>
-        <w:t>cbc:IssueDate</w:t>
-      </w:r>
-      <w:proofErr w:type="spellEnd"/>
-      <w:proofErr w:type="gramEnd"/>
-      <w:r>
-        <w:t>')</w:t>
-      </w:r>
-    </w:p>
-    <w:p>
-      <w:pPr>
-        <w:spacing w:after="0"/>
-      </w:pPr>
-      <w:r>
-        <w:t xml:space="preserve">    tipo = </w:t>
-      </w:r>
-      <w:proofErr w:type="spellStart"/>
-      <w:proofErr w:type="gramStart"/>
-      <w:r>
-        <w:t>txt</w:t>
-      </w:r>
-      <w:proofErr w:type="spellEnd"/>
-      <w:r>
-        <w:t>(</w:t>
-      </w:r>
-      <w:proofErr w:type="spellStart"/>
-      <w:proofErr w:type="gramEnd"/>
-      <w:r>
-        <w:t>root</w:t>
-      </w:r>
-      <w:proofErr w:type="spellEnd"/>
-      <w:r>
-        <w:t xml:space="preserve">, </w:t>
-      </w:r>
-      <w:proofErr w:type="gramStart"/>
-      <w:r>
-        <w:t>'./</w:t>
-      </w:r>
-      <w:proofErr w:type="gramEnd"/>
-      <w:r>
-        <w:t>/</w:t>
-      </w:r>
-      <w:proofErr w:type="spellStart"/>
-      <w:proofErr w:type="gramStart"/>
-      <w:r>
-        <w:t>cbc:InvoiceTypeCode</w:t>
-      </w:r>
-      <w:proofErr w:type="spellEnd"/>
-      <w:r>
-        <w:t>')  #</w:t>
-      </w:r>
-      <w:proofErr w:type="gramEnd"/>
-      <w:r>
-        <w:t xml:space="preserve"> "01" = factura venta</w:t>
+        <w:t>    numero = txt(root, './/cbc:ID')</w:t>
+      </w:r>
+    </w:p>
+    <w:p>
+      <w:pPr>
+        <w:spacing w:after="0"/>
+      </w:pPr>
+      <w:r>
+        <w:t>    fecha = txt(root, './/cbc:IssueDate')</w:t>
+      </w:r>
+    </w:p>
+    <w:p>
+      <w:pPr>
+        <w:spacing w:after="0"/>
+      </w:pPr>
+      <w:r>
+        <w:t>    tipo = txt(root, './/cbc:InvoiceTypeCode')  # "01" = factura venta</w:t>
       </w:r>
     </w:p>
     <w:p>
@@ -2053,43 +1305,7 @@
         <w:spacing w:after="0"/>
       </w:pPr>
       <w:r>
-        <w:t xml:space="preserve">    </w:t>
-      </w:r>
-      <w:proofErr w:type="spellStart"/>
-      <w:r>
-        <w:t>sup</w:t>
-      </w:r>
-      <w:proofErr w:type="spellEnd"/>
-      <w:r>
-        <w:t xml:space="preserve"> = </w:t>
-      </w:r>
-      <w:proofErr w:type="spellStart"/>
-      <w:proofErr w:type="gramStart"/>
-      <w:r>
-        <w:t>root.find</w:t>
-      </w:r>
-      <w:proofErr w:type="spellEnd"/>
-      <w:proofErr w:type="gramEnd"/>
-      <w:r>
-        <w:t>(</w:t>
-      </w:r>
-      <w:proofErr w:type="gramStart"/>
-      <w:r>
-        <w:t>'./</w:t>
-      </w:r>
-      <w:proofErr w:type="gramEnd"/>
-      <w:r>
-        <w:t>/</w:t>
-      </w:r>
-      <w:proofErr w:type="spellStart"/>
-      <w:proofErr w:type="gramStart"/>
-      <w:r>
-        <w:t>cac:AccountingSupplierParty</w:t>
-      </w:r>
-      <w:proofErr w:type="spellEnd"/>
-      <w:proofErr w:type="gramEnd"/>
-      <w:r>
-        <w:t>', NS)</w:t>
+        <w:t>    sup = root.find('.//cac:AccountingSupplierParty', NS)</w:t>
       </w:r>
     </w:p>
     <w:p>
@@ -2105,95 +1321,15 @@
         <w:spacing w:after="0"/>
       </w:pPr>
       <w:r>
-        <w:t>        "</w:t>
-      </w:r>
-      <w:proofErr w:type="spellStart"/>
-      <w:r>
-        <w:t>nit</w:t>
-      </w:r>
-      <w:proofErr w:type="spellEnd"/>
-      <w:r>
-        <w:t xml:space="preserve">": </w:t>
-      </w:r>
-      <w:proofErr w:type="spellStart"/>
-      <w:proofErr w:type="gramStart"/>
-      <w:r>
-        <w:t>txt</w:t>
-      </w:r>
-      <w:proofErr w:type="spellEnd"/>
-      <w:r>
-        <w:t>(</w:t>
-      </w:r>
-      <w:proofErr w:type="spellStart"/>
-      <w:proofErr w:type="gramEnd"/>
-      <w:r>
-        <w:t>sup</w:t>
-      </w:r>
-      <w:proofErr w:type="spellEnd"/>
-      <w:r>
-        <w:t xml:space="preserve">, </w:t>
-      </w:r>
-      <w:proofErr w:type="gramStart"/>
-      <w:r>
-        <w:t>'./</w:t>
-      </w:r>
-      <w:proofErr w:type="gramEnd"/>
-      <w:r>
-        <w:t>/</w:t>
-      </w:r>
-      <w:proofErr w:type="spellStart"/>
-      <w:proofErr w:type="gramStart"/>
-      <w:r>
-        <w:t>cbc:CompanyID</w:t>
-      </w:r>
-      <w:proofErr w:type="spellEnd"/>
-      <w:proofErr w:type="gramEnd"/>
-      <w:r>
-        <w:t>'),</w:t>
-      </w:r>
-    </w:p>
-    <w:p>
-      <w:pPr>
-        <w:spacing w:after="0"/>
-      </w:pPr>
-      <w:r>
-        <w:t xml:space="preserve">        "nombre": </w:t>
-      </w:r>
-      <w:proofErr w:type="spellStart"/>
-      <w:proofErr w:type="gramStart"/>
-      <w:r>
-        <w:t>txt</w:t>
-      </w:r>
-      <w:proofErr w:type="spellEnd"/>
-      <w:r>
-        <w:t>(</w:t>
-      </w:r>
-      <w:proofErr w:type="spellStart"/>
-      <w:proofErr w:type="gramEnd"/>
-      <w:r>
-        <w:t>sup</w:t>
-      </w:r>
-      <w:proofErr w:type="spellEnd"/>
-      <w:r>
-        <w:t xml:space="preserve">, </w:t>
-      </w:r>
-      <w:proofErr w:type="gramStart"/>
-      <w:r>
-        <w:t>'./</w:t>
-      </w:r>
-      <w:proofErr w:type="gramEnd"/>
-      <w:r>
-        <w:t>/</w:t>
-      </w:r>
-      <w:proofErr w:type="spellStart"/>
-      <w:proofErr w:type="gramStart"/>
-      <w:r>
-        <w:t>cbc:RegistrationName</w:t>
-      </w:r>
-      <w:proofErr w:type="spellEnd"/>
-      <w:proofErr w:type="gramEnd"/>
-      <w:r>
-        <w:t>'),</w:t>
+        <w:t>        "nit": txt(sup, './/cbc:CompanyID'),</w:t>
+      </w:r>
+    </w:p>
+    <w:p>
+      <w:pPr>
+        <w:spacing w:after="0"/>
+      </w:pPr>
+      <w:r>
+        <w:t>        "nombre": txt(sup, './/cbc:RegistrationName'),</w:t>
       </w:r>
     </w:p>
     <w:p>
@@ -2223,43 +1359,7 @@
         <w:spacing w:after="0"/>
       </w:pPr>
       <w:r>
-        <w:t xml:space="preserve">    </w:t>
-      </w:r>
-      <w:proofErr w:type="spellStart"/>
-      <w:r>
-        <w:t>mon</w:t>
-      </w:r>
-      <w:proofErr w:type="spellEnd"/>
-      <w:r>
-        <w:t xml:space="preserve"> = </w:t>
-      </w:r>
-      <w:proofErr w:type="spellStart"/>
-      <w:proofErr w:type="gramStart"/>
-      <w:r>
-        <w:t>root.find</w:t>
-      </w:r>
-      <w:proofErr w:type="spellEnd"/>
-      <w:proofErr w:type="gramEnd"/>
-      <w:r>
-        <w:t>(</w:t>
-      </w:r>
-      <w:proofErr w:type="gramStart"/>
-      <w:r>
-        <w:t>'./</w:t>
-      </w:r>
-      <w:proofErr w:type="gramEnd"/>
-      <w:r>
-        <w:t>/</w:t>
-      </w:r>
-      <w:proofErr w:type="spellStart"/>
-      <w:proofErr w:type="gramStart"/>
-      <w:r>
-        <w:t>cac:LegalMonetaryTotal</w:t>
-      </w:r>
-      <w:proofErr w:type="spellEnd"/>
-      <w:proofErr w:type="gramEnd"/>
-      <w:r>
-        <w:t>', NS)</w:t>
+        <w:t>    mon = root.find('.//cac:LegalMonetaryTotal', NS)</w:t>
       </w:r>
     </w:p>
     <w:p>
@@ -2275,171 +1375,23 @@
         <w:spacing w:after="0"/>
       </w:pPr>
       <w:r>
-        <w:t xml:space="preserve">        "subtotal": </w:t>
-      </w:r>
-      <w:proofErr w:type="spellStart"/>
-      <w:proofErr w:type="gramStart"/>
-      <w:r>
-        <w:t>float</w:t>
-      </w:r>
-      <w:proofErr w:type="spellEnd"/>
-      <w:r>
-        <w:t>(</w:t>
-      </w:r>
-      <w:proofErr w:type="spellStart"/>
-      <w:r>
-        <w:t>txt</w:t>
-      </w:r>
-      <w:proofErr w:type="spellEnd"/>
-      <w:r>
-        <w:t>(</w:t>
-      </w:r>
-      <w:proofErr w:type="spellStart"/>
-      <w:proofErr w:type="gramEnd"/>
-      <w:r>
-        <w:t>mon</w:t>
-      </w:r>
-      <w:proofErr w:type="spellEnd"/>
-      <w:r>
-        <w:t>, '</w:t>
-      </w:r>
-      <w:proofErr w:type="spellStart"/>
-      <w:proofErr w:type="gramStart"/>
-      <w:r>
-        <w:t>cbc:LineExtensionAmount</w:t>
-      </w:r>
-      <w:proofErr w:type="spellEnd"/>
-      <w:proofErr w:type="gramEnd"/>
-      <w:r>
-        <w:t xml:space="preserve">') </w:t>
-      </w:r>
-      <w:proofErr w:type="spellStart"/>
-      <w:r>
-        <w:t>or</w:t>
-      </w:r>
-      <w:proofErr w:type="spellEnd"/>
-      <w:r>
-        <w:t xml:space="preserve"> 0),</w:t>
-      </w:r>
-    </w:p>
-    <w:p>
-      <w:pPr>
-        <w:spacing w:after="0"/>
-      </w:pPr>
-      <w:r>
-        <w:t>        "</w:t>
-      </w:r>
-      <w:proofErr w:type="spellStart"/>
-      <w:r>
-        <w:t>total_con_iva</w:t>
-      </w:r>
-      <w:proofErr w:type="spellEnd"/>
-      <w:r>
-        <w:t xml:space="preserve">": </w:t>
-      </w:r>
-      <w:proofErr w:type="spellStart"/>
-      <w:proofErr w:type="gramStart"/>
-      <w:r>
-        <w:t>float</w:t>
-      </w:r>
-      <w:proofErr w:type="spellEnd"/>
-      <w:r>
-        <w:t>(</w:t>
-      </w:r>
-      <w:proofErr w:type="spellStart"/>
-      <w:r>
-        <w:t>txt</w:t>
-      </w:r>
-      <w:proofErr w:type="spellEnd"/>
-      <w:r>
-        <w:t>(</w:t>
-      </w:r>
-      <w:proofErr w:type="spellStart"/>
-      <w:proofErr w:type="gramEnd"/>
-      <w:r>
-        <w:t>mon</w:t>
-      </w:r>
-      <w:proofErr w:type="spellEnd"/>
-      <w:r>
-        <w:t>, '</w:t>
-      </w:r>
-      <w:proofErr w:type="spellStart"/>
-      <w:proofErr w:type="gramStart"/>
-      <w:r>
-        <w:t>cbc:TaxInclusiveAmount</w:t>
-      </w:r>
-      <w:proofErr w:type="spellEnd"/>
-      <w:proofErr w:type="gramEnd"/>
-      <w:r>
-        <w:t xml:space="preserve">') </w:t>
-      </w:r>
-      <w:proofErr w:type="spellStart"/>
-      <w:r>
-        <w:t>or</w:t>
-      </w:r>
-      <w:proofErr w:type="spellEnd"/>
-      <w:r>
-        <w:t xml:space="preserve"> 0),</w:t>
-      </w:r>
-    </w:p>
-    <w:p>
-      <w:pPr>
-        <w:spacing w:after="0"/>
-      </w:pPr>
-      <w:r>
-        <w:t>        "</w:t>
-      </w:r>
-      <w:proofErr w:type="spellStart"/>
-      <w:r>
-        <w:t>total_pagar</w:t>
-      </w:r>
-      <w:proofErr w:type="spellEnd"/>
-      <w:r>
-        <w:t xml:space="preserve">": </w:t>
-      </w:r>
-      <w:proofErr w:type="spellStart"/>
-      <w:proofErr w:type="gramStart"/>
-      <w:r>
-        <w:t>float</w:t>
-      </w:r>
-      <w:proofErr w:type="spellEnd"/>
-      <w:r>
-        <w:t>(</w:t>
-      </w:r>
-      <w:proofErr w:type="spellStart"/>
-      <w:r>
-        <w:t>txt</w:t>
-      </w:r>
-      <w:proofErr w:type="spellEnd"/>
-      <w:r>
-        <w:t>(</w:t>
-      </w:r>
-      <w:proofErr w:type="spellStart"/>
-      <w:proofErr w:type="gramEnd"/>
-      <w:r>
-        <w:t>mon</w:t>
-      </w:r>
-      <w:proofErr w:type="spellEnd"/>
-      <w:r>
-        <w:t>, '</w:t>
-      </w:r>
-      <w:proofErr w:type="spellStart"/>
-      <w:proofErr w:type="gramStart"/>
-      <w:r>
-        <w:t>cbc:PayableAmount</w:t>
-      </w:r>
-      <w:proofErr w:type="spellEnd"/>
-      <w:proofErr w:type="gramEnd"/>
-      <w:r>
-        <w:t xml:space="preserve">') </w:t>
-      </w:r>
-      <w:proofErr w:type="spellStart"/>
-      <w:r>
-        <w:t>or</w:t>
-      </w:r>
-      <w:proofErr w:type="spellEnd"/>
-      <w:r>
-        <w:t xml:space="preserve"> 0),</w:t>
+        <w:t>        "subtotal": float(txt(mon, 'cbc:LineExtensionAmount') or 0),</w:t>
+      </w:r>
+    </w:p>
+    <w:p>
+      <w:pPr>
+        <w:spacing w:after="0"/>
+      </w:pPr>
+      <w:r>
+        <w:t>        "total_con_iva": float(txt(mon, 'cbc:TaxInclusiveAmount') or 0),</w:t>
+      </w:r>
+    </w:p>
+    <w:p>
+      <w:pPr>
+        <w:spacing w:after="0"/>
+      </w:pPr>
+      <w:r>
+        <w:t>        "total_pagar": float(txt(mon, 'cbc:PayableAmount') or 0),</w:t>
       </w:r>
     </w:p>
     <w:p>
@@ -2460,167 +1412,23 @@
         <w:spacing w:after="0"/>
       </w:pPr>
       <w:r>
-        <w:t xml:space="preserve">    # PASO 5: IVA total (solo el primer </w:t>
-      </w:r>
-      <w:proofErr w:type="spellStart"/>
-      <w:r>
-        <w:t>TaxTotal</w:t>
-      </w:r>
-      <w:proofErr w:type="spellEnd"/>
-      <w:r>
-        <w:t xml:space="preserve"> = total factura)</w:t>
-      </w:r>
-    </w:p>
-    <w:p>
-      <w:pPr>
-        <w:spacing w:after="0"/>
-      </w:pPr>
-      <w:r>
-        <w:t xml:space="preserve">    </w:t>
-      </w:r>
-      <w:proofErr w:type="spellStart"/>
-      <w:r>
-        <w:t>primer_tax</w:t>
-      </w:r>
-      <w:proofErr w:type="spellEnd"/>
-      <w:r>
-        <w:t xml:space="preserve"> = </w:t>
-      </w:r>
-      <w:proofErr w:type="spellStart"/>
-      <w:proofErr w:type="gramStart"/>
-      <w:r>
-        <w:t>root.find</w:t>
-      </w:r>
-      <w:proofErr w:type="spellEnd"/>
-      <w:proofErr w:type="gramEnd"/>
-      <w:r>
-        <w:t>(</w:t>
-      </w:r>
-      <w:proofErr w:type="gramStart"/>
-      <w:r>
-        <w:t>'./</w:t>
-      </w:r>
-      <w:proofErr w:type="gramEnd"/>
-      <w:r>
-        <w:t>/</w:t>
-      </w:r>
-      <w:proofErr w:type="spellStart"/>
-      <w:proofErr w:type="gramStart"/>
-      <w:r>
-        <w:t>cac:TaxTotal</w:t>
-      </w:r>
-      <w:proofErr w:type="spellEnd"/>
-      <w:proofErr w:type="gramEnd"/>
-      <w:r>
-        <w:t>', NS)</w:t>
-      </w:r>
-    </w:p>
-    <w:p>
-      <w:pPr>
-        <w:spacing w:after="0"/>
-      </w:pPr>
-      <w:r>
-        <w:t xml:space="preserve">    </w:t>
-      </w:r>
-      <w:proofErr w:type="spellStart"/>
-      <w:r>
-        <w:t>iva_total</w:t>
-      </w:r>
-      <w:proofErr w:type="spellEnd"/>
-      <w:r>
-        <w:t xml:space="preserve"> = </w:t>
-      </w:r>
-      <w:proofErr w:type="spellStart"/>
-      <w:proofErr w:type="gramStart"/>
-      <w:r>
-        <w:t>float</w:t>
-      </w:r>
-      <w:proofErr w:type="spellEnd"/>
-      <w:r>
-        <w:t>(</w:t>
-      </w:r>
-      <w:proofErr w:type="spellStart"/>
-      <w:r>
-        <w:t>txt</w:t>
-      </w:r>
-      <w:proofErr w:type="spellEnd"/>
-      <w:r>
-        <w:t>(</w:t>
-      </w:r>
-      <w:proofErr w:type="spellStart"/>
-      <w:proofErr w:type="gramEnd"/>
-      <w:r>
-        <w:t>primer_tax</w:t>
-      </w:r>
-      <w:proofErr w:type="spellEnd"/>
-      <w:r>
-        <w:t>, '</w:t>
-      </w:r>
-      <w:proofErr w:type="spellStart"/>
-      <w:proofErr w:type="gramStart"/>
-      <w:r>
-        <w:t>cbc:TaxAmount</w:t>
-      </w:r>
-      <w:proofErr w:type="spellEnd"/>
-      <w:proofErr w:type="gramEnd"/>
-      <w:r>
-        <w:t xml:space="preserve">') </w:t>
-      </w:r>
-      <w:proofErr w:type="spellStart"/>
-      <w:r>
-        <w:t>or</w:t>
-      </w:r>
-      <w:proofErr w:type="spellEnd"/>
-      <w:r>
-        <w:t xml:space="preserve"> 0) </w:t>
-      </w:r>
-      <w:proofErr w:type="spellStart"/>
-      <w:r>
-        <w:t>if</w:t>
-      </w:r>
-      <w:proofErr w:type="spellEnd"/>
-      <w:r>
-        <w:t xml:space="preserve"> </w:t>
-      </w:r>
-      <w:proofErr w:type="spellStart"/>
-      <w:r>
-        <w:t>primer_tax</w:t>
-      </w:r>
-      <w:proofErr w:type="spellEnd"/>
-      <w:r>
-        <w:t xml:space="preserve"> </w:t>
-      </w:r>
-      <w:proofErr w:type="spellStart"/>
-      <w:r>
-        <w:t>is</w:t>
-      </w:r>
-      <w:proofErr w:type="spellEnd"/>
-      <w:r>
-        <w:t xml:space="preserve"> </w:t>
-      </w:r>
-      <w:proofErr w:type="spellStart"/>
-      <w:r>
-        <w:t>not</w:t>
-      </w:r>
-      <w:proofErr w:type="spellEnd"/>
-      <w:r>
-        <w:t xml:space="preserve"> </w:t>
-      </w:r>
-      <w:proofErr w:type="spellStart"/>
-      <w:r>
-        <w:t>None</w:t>
-      </w:r>
-      <w:proofErr w:type="spellEnd"/>
-      <w:r>
-        <w:t xml:space="preserve"> </w:t>
-      </w:r>
-      <w:proofErr w:type="spellStart"/>
-      <w:r>
-        <w:t>else</w:t>
-      </w:r>
-      <w:proofErr w:type="spellEnd"/>
-      <w:r>
-        <w:t xml:space="preserve"> 0</w:t>
+        <w:t>    # PASO 5: IVA total (solo el primer TaxTotal = total factura)</w:t>
+      </w:r>
+    </w:p>
+    <w:p>
+      <w:pPr>
+        <w:spacing w:after="0"/>
+      </w:pPr>
+      <w:r>
+        <w:t>    primer_tax = root.find('.//cac:TaxTotal', NS)</w:t>
+      </w:r>
+    </w:p>
+    <w:p>
+      <w:pPr>
+        <w:spacing w:after="0"/>
+      </w:pPr>
+      <w:r>
+        <w:t>    iva_total = float(txt(primer_tax, 'cbc:TaxAmount') or 0) if primer_tax is not None else 0</w:t>
       </w:r>
     </w:p>
     <w:p>
@@ -2641,444 +1449,79 @@
         <w:spacing w:after="0"/>
       </w:pPr>
       <w:r>
-        <w:t xml:space="preserve">    </w:t>
-      </w:r>
-      <w:proofErr w:type="spellStart"/>
-      <w:r>
-        <w:t>lineas</w:t>
-      </w:r>
-      <w:proofErr w:type="spellEnd"/>
-      <w:r>
-        <w:t xml:space="preserve"> = []</w:t>
-      </w:r>
-    </w:p>
-    <w:p>
-      <w:pPr>
-        <w:spacing w:after="0"/>
-      </w:pPr>
-      <w:r>
-        <w:t xml:space="preserve">    </w:t>
-      </w:r>
-      <w:proofErr w:type="spellStart"/>
-      <w:r>
-        <w:t>for</w:t>
-      </w:r>
-      <w:proofErr w:type="spellEnd"/>
-      <w:r>
-        <w:t xml:space="preserve"> line in </w:t>
-      </w:r>
-      <w:proofErr w:type="spellStart"/>
-      <w:proofErr w:type="gramStart"/>
-      <w:r>
-        <w:t>root.findall</w:t>
-      </w:r>
-      <w:proofErr w:type="spellEnd"/>
-      <w:proofErr w:type="gramEnd"/>
-      <w:r>
-        <w:t>(</w:t>
-      </w:r>
-      <w:proofErr w:type="gramStart"/>
-      <w:r>
-        <w:t>'./</w:t>
-      </w:r>
-      <w:proofErr w:type="gramEnd"/>
-      <w:r>
-        <w:t>/</w:t>
-      </w:r>
-      <w:proofErr w:type="spellStart"/>
-      <w:proofErr w:type="gramStart"/>
-      <w:r>
-        <w:t>cac:InvoiceLine</w:t>
-      </w:r>
-      <w:proofErr w:type="spellEnd"/>
-      <w:proofErr w:type="gramEnd"/>
-      <w:r>
-        <w:t>', NS):</w:t>
-      </w:r>
-    </w:p>
-    <w:p>
-      <w:pPr>
-        <w:spacing w:after="0"/>
-      </w:pPr>
-      <w:r>
-        <w:t xml:space="preserve">        </w:t>
-      </w:r>
-      <w:proofErr w:type="spellStart"/>
-      <w:proofErr w:type="gramStart"/>
-      <w:r>
-        <w:t>lineas.append</w:t>
-      </w:r>
-      <w:proofErr w:type="spellEnd"/>
-      <w:proofErr w:type="gramEnd"/>
-      <w:r>
-        <w:t>({</w:t>
-      </w:r>
-    </w:p>
-    <w:p>
-      <w:pPr>
-        <w:spacing w:after="0"/>
-      </w:pPr>
-      <w:r>
-        <w:t xml:space="preserve">            "id": </w:t>
-      </w:r>
-      <w:proofErr w:type="spellStart"/>
-      <w:proofErr w:type="gramStart"/>
-      <w:r>
-        <w:t>txt</w:t>
-      </w:r>
-      <w:proofErr w:type="spellEnd"/>
-      <w:r>
-        <w:t>(</w:t>
-      </w:r>
-      <w:proofErr w:type="gramEnd"/>
-      <w:r>
-        <w:t>line, '</w:t>
-      </w:r>
-      <w:proofErr w:type="spellStart"/>
-      <w:r>
-        <w:t>cbc:ID</w:t>
-      </w:r>
-      <w:proofErr w:type="spellEnd"/>
-      <w:r>
-        <w:t>'),</w:t>
-      </w:r>
-    </w:p>
-    <w:p>
-      <w:pPr>
-        <w:spacing w:after="0"/>
-      </w:pPr>
-      <w:r>
-        <w:t>            "</w:t>
-      </w:r>
-      <w:proofErr w:type="spellStart"/>
-      <w:r>
-        <w:t>descripcion</w:t>
-      </w:r>
-      <w:proofErr w:type="spellEnd"/>
-      <w:r>
-        <w:t xml:space="preserve">": </w:t>
-      </w:r>
-      <w:proofErr w:type="spellStart"/>
-      <w:proofErr w:type="gramStart"/>
-      <w:r>
-        <w:t>txt</w:t>
-      </w:r>
-      <w:proofErr w:type="spellEnd"/>
-      <w:r>
-        <w:t>(</w:t>
-      </w:r>
-      <w:proofErr w:type="gramEnd"/>
-      <w:r>
-        <w:t xml:space="preserve">line, </w:t>
-      </w:r>
-      <w:proofErr w:type="gramStart"/>
-      <w:r>
-        <w:t>'./</w:t>
-      </w:r>
-      <w:proofErr w:type="gramEnd"/>
-      <w:r>
-        <w:t>/</w:t>
-      </w:r>
-      <w:proofErr w:type="spellStart"/>
-      <w:proofErr w:type="gramStart"/>
-      <w:r>
-        <w:t>cbc:Description</w:t>
-      </w:r>
-      <w:proofErr w:type="spellEnd"/>
-      <w:proofErr w:type="gramEnd"/>
-      <w:r>
-        <w:t>'),</w:t>
-      </w:r>
-    </w:p>
-    <w:p>
-      <w:pPr>
-        <w:spacing w:after="0"/>
-      </w:pPr>
-      <w:r>
-        <w:t xml:space="preserve">            "cantidad": </w:t>
-      </w:r>
-      <w:proofErr w:type="spellStart"/>
-      <w:proofErr w:type="gramStart"/>
-      <w:r>
-        <w:t>float</w:t>
-      </w:r>
-      <w:proofErr w:type="spellEnd"/>
-      <w:r>
-        <w:t>(</w:t>
-      </w:r>
-      <w:proofErr w:type="spellStart"/>
-      <w:r>
-        <w:t>txt</w:t>
-      </w:r>
-      <w:proofErr w:type="spellEnd"/>
-      <w:r>
-        <w:t>(</w:t>
-      </w:r>
-      <w:proofErr w:type="gramEnd"/>
-      <w:r>
-        <w:t>line, '</w:t>
-      </w:r>
-      <w:proofErr w:type="spellStart"/>
-      <w:proofErr w:type="gramStart"/>
-      <w:r>
-        <w:t>cbc:InvoicedQuantity</w:t>
-      </w:r>
-      <w:proofErr w:type="spellEnd"/>
-      <w:proofErr w:type="gramEnd"/>
-      <w:r>
-        <w:t xml:space="preserve">') </w:t>
-      </w:r>
-      <w:proofErr w:type="spellStart"/>
-      <w:r>
-        <w:t>or</w:t>
-      </w:r>
-      <w:proofErr w:type="spellEnd"/>
-      <w:r>
-        <w:t xml:space="preserve"> 0),</w:t>
-      </w:r>
-    </w:p>
-    <w:p>
-      <w:pPr>
-        <w:spacing w:after="0"/>
-      </w:pPr>
-      <w:r>
-        <w:t>            "</w:t>
-      </w:r>
-      <w:proofErr w:type="spellStart"/>
-      <w:r>
-        <w:t>precio_unitario</w:t>
-      </w:r>
-      <w:proofErr w:type="spellEnd"/>
-      <w:r>
-        <w:t xml:space="preserve">": </w:t>
-      </w:r>
-      <w:proofErr w:type="spellStart"/>
-      <w:proofErr w:type="gramStart"/>
-      <w:r>
-        <w:t>float</w:t>
-      </w:r>
-      <w:proofErr w:type="spellEnd"/>
-      <w:r>
-        <w:t>(</w:t>
-      </w:r>
-      <w:proofErr w:type="spellStart"/>
-      <w:r>
-        <w:t>txt</w:t>
-      </w:r>
-      <w:proofErr w:type="spellEnd"/>
-      <w:r>
-        <w:t>(</w:t>
-      </w:r>
-      <w:proofErr w:type="gramEnd"/>
-      <w:r>
-        <w:t xml:space="preserve">line, </w:t>
-      </w:r>
-      <w:proofErr w:type="gramStart"/>
-      <w:r>
-        <w:t>'./</w:t>
-      </w:r>
-      <w:proofErr w:type="gramEnd"/>
-      <w:r>
-        <w:t>/</w:t>
-      </w:r>
-      <w:proofErr w:type="spellStart"/>
-      <w:proofErr w:type="gramStart"/>
-      <w:r>
-        <w:t>cbc:PriceAmount</w:t>
-      </w:r>
-      <w:proofErr w:type="spellEnd"/>
-      <w:proofErr w:type="gramEnd"/>
-      <w:r>
-        <w:t xml:space="preserve">') </w:t>
-      </w:r>
-      <w:proofErr w:type="spellStart"/>
-      <w:r>
-        <w:t>or</w:t>
-      </w:r>
-      <w:proofErr w:type="spellEnd"/>
-      <w:r>
-        <w:t xml:space="preserve"> 0),</w:t>
-      </w:r>
-    </w:p>
-    <w:p>
-      <w:pPr>
-        <w:spacing w:after="0"/>
-      </w:pPr>
-      <w:r>
-        <w:t>            "</w:t>
-      </w:r>
-      <w:proofErr w:type="spellStart"/>
-      <w:r>
-        <w:t>subtotal_linea</w:t>
-      </w:r>
-      <w:proofErr w:type="spellEnd"/>
-      <w:r>
-        <w:t xml:space="preserve">": </w:t>
-      </w:r>
-      <w:proofErr w:type="spellStart"/>
-      <w:proofErr w:type="gramStart"/>
-      <w:r>
-        <w:t>float</w:t>
-      </w:r>
-      <w:proofErr w:type="spellEnd"/>
-      <w:r>
-        <w:t>(</w:t>
-      </w:r>
-      <w:proofErr w:type="spellStart"/>
-      <w:r>
-        <w:t>txt</w:t>
-      </w:r>
-      <w:proofErr w:type="spellEnd"/>
-      <w:r>
-        <w:t>(</w:t>
-      </w:r>
-      <w:proofErr w:type="gramEnd"/>
-      <w:r>
-        <w:t>line, '</w:t>
-      </w:r>
-      <w:proofErr w:type="spellStart"/>
-      <w:proofErr w:type="gramStart"/>
-      <w:r>
-        <w:t>cbc:LineExtensionAmount</w:t>
-      </w:r>
-      <w:proofErr w:type="spellEnd"/>
-      <w:proofErr w:type="gramEnd"/>
-      <w:r>
-        <w:t xml:space="preserve">') </w:t>
-      </w:r>
-      <w:proofErr w:type="spellStart"/>
-      <w:r>
-        <w:t>or</w:t>
-      </w:r>
-      <w:proofErr w:type="spellEnd"/>
-      <w:r>
-        <w:t xml:space="preserve"> 0),</w:t>
-      </w:r>
-    </w:p>
-    <w:p>
-      <w:pPr>
-        <w:spacing w:after="0"/>
-      </w:pPr>
-      <w:r>
-        <w:t>            "</w:t>
-      </w:r>
-      <w:proofErr w:type="spellStart"/>
-      <w:r>
-        <w:t>iva_pct</w:t>
-      </w:r>
-      <w:proofErr w:type="spellEnd"/>
-      <w:r>
-        <w:t xml:space="preserve">": </w:t>
-      </w:r>
-      <w:proofErr w:type="spellStart"/>
-      <w:proofErr w:type="gramStart"/>
-      <w:r>
-        <w:t>float</w:t>
-      </w:r>
-      <w:proofErr w:type="spellEnd"/>
-      <w:r>
-        <w:t>(</w:t>
-      </w:r>
-      <w:proofErr w:type="spellStart"/>
-      <w:r>
-        <w:t>txt</w:t>
-      </w:r>
-      <w:proofErr w:type="spellEnd"/>
-      <w:r>
-        <w:t>(</w:t>
-      </w:r>
-      <w:proofErr w:type="gramEnd"/>
-      <w:r>
-        <w:t xml:space="preserve">line, </w:t>
-      </w:r>
-      <w:proofErr w:type="gramStart"/>
-      <w:r>
-        <w:t>'./</w:t>
-      </w:r>
-      <w:proofErr w:type="gramEnd"/>
-      <w:r>
-        <w:t>/</w:t>
-      </w:r>
-      <w:proofErr w:type="spellStart"/>
-      <w:proofErr w:type="gramStart"/>
-      <w:r>
-        <w:t>cbc:Percent</w:t>
-      </w:r>
-      <w:proofErr w:type="spellEnd"/>
-      <w:proofErr w:type="gramEnd"/>
-      <w:r>
-        <w:t xml:space="preserve">') </w:t>
-      </w:r>
-      <w:proofErr w:type="spellStart"/>
-      <w:r>
-        <w:t>or</w:t>
-      </w:r>
-      <w:proofErr w:type="spellEnd"/>
-      <w:r>
-        <w:t xml:space="preserve"> 0),</w:t>
-      </w:r>
-    </w:p>
-    <w:p>
-      <w:pPr>
-        <w:spacing w:after="0"/>
-      </w:pPr>
-      <w:r>
-        <w:t>            "</w:t>
-      </w:r>
-      <w:proofErr w:type="spellStart"/>
-      <w:r>
-        <w:t>iva_valor</w:t>
-      </w:r>
-      <w:proofErr w:type="spellEnd"/>
-      <w:r>
-        <w:t xml:space="preserve">": </w:t>
-      </w:r>
-      <w:proofErr w:type="spellStart"/>
-      <w:proofErr w:type="gramStart"/>
-      <w:r>
-        <w:t>float</w:t>
-      </w:r>
-      <w:proofErr w:type="spellEnd"/>
-      <w:r>
-        <w:t>(</w:t>
-      </w:r>
-      <w:proofErr w:type="spellStart"/>
-      <w:r>
-        <w:t>txt</w:t>
-      </w:r>
-      <w:proofErr w:type="spellEnd"/>
-      <w:r>
-        <w:t>(</w:t>
-      </w:r>
-      <w:proofErr w:type="gramEnd"/>
-      <w:r>
-        <w:t xml:space="preserve">line, </w:t>
-      </w:r>
-      <w:proofErr w:type="gramStart"/>
-      <w:r>
-        <w:t>'./</w:t>
-      </w:r>
-      <w:proofErr w:type="gramEnd"/>
-      <w:r>
-        <w:t>/</w:t>
-      </w:r>
-      <w:proofErr w:type="spellStart"/>
-      <w:proofErr w:type="gramStart"/>
-      <w:r>
-        <w:t>cbc:TaxAmount</w:t>
-      </w:r>
-      <w:proofErr w:type="spellEnd"/>
-      <w:proofErr w:type="gramEnd"/>
-      <w:r>
-        <w:t xml:space="preserve">') </w:t>
-      </w:r>
-      <w:proofErr w:type="spellStart"/>
-      <w:r>
-        <w:t>or</w:t>
-      </w:r>
-      <w:proofErr w:type="spellEnd"/>
-      <w:r>
-        <w:t xml:space="preserve"> 0),</w:t>
+        <w:t>    lineas = []</w:t>
+      </w:r>
+    </w:p>
+    <w:p>
+      <w:pPr>
+        <w:spacing w:after="0"/>
+      </w:pPr>
+      <w:r>
+        <w:t>    for line in root.findall('.//cac:InvoiceLine', NS):</w:t>
+      </w:r>
+    </w:p>
+    <w:p>
+      <w:pPr>
+        <w:spacing w:after="0"/>
+      </w:pPr>
+      <w:r>
+        <w:t>        lineas.append({</w:t>
+      </w:r>
+    </w:p>
+    <w:p>
+      <w:pPr>
+        <w:spacing w:after="0"/>
+      </w:pPr>
+      <w:r>
+        <w:t>            "id": txt(line, 'cbc:ID'),</w:t>
+      </w:r>
+    </w:p>
+    <w:p>
+      <w:pPr>
+        <w:spacing w:after="0"/>
+      </w:pPr>
+      <w:r>
+        <w:t>            "descripcion": txt(line, './/cbc:Description'),</w:t>
+      </w:r>
+    </w:p>
+    <w:p>
+      <w:pPr>
+        <w:spacing w:after="0"/>
+      </w:pPr>
+      <w:r>
+        <w:t>            "cantidad": float(txt(line, 'cbc:InvoicedQuantity') or 0),</w:t>
+      </w:r>
+    </w:p>
+    <w:p>
+      <w:pPr>
+        <w:spacing w:after="0"/>
+      </w:pPr>
+      <w:r>
+        <w:t>            "precio_unitario": float(txt(line, './/cbc:PriceAmount') or 0),</w:t>
+      </w:r>
+    </w:p>
+    <w:p>
+      <w:pPr>
+        <w:spacing w:after="0"/>
+      </w:pPr>
+      <w:r>
+        <w:t>            "subtotal_linea": float(txt(line, 'cbc:LineExtensionAmount') or 0),</w:t>
+      </w:r>
+    </w:p>
+    <w:p>
+      <w:pPr>
+        <w:spacing w:after="0"/>
+      </w:pPr>
+      <w:r>
+        <w:t>            "iva_pct": float(txt(line, './/cbc:Percent') or 0),</w:t>
+      </w:r>
+    </w:p>
+    <w:p>
+      <w:pPr>
+        <w:spacing w:after="0"/>
+      </w:pPr>
+      <w:r>
+        <w:t>            "iva_valor": float(txt(line, './/cbc:TaxAmount') or 0),</w:t>
       </w:r>
     </w:p>
     <w:p>
@@ -3099,31 +1542,15 @@
         <w:spacing w:after="0"/>
       </w:pPr>
       <w:r>
-        <w:t xml:space="preserve">    </w:t>
-      </w:r>
-      <w:proofErr w:type="spellStart"/>
-      <w:r>
-        <w:t>return</w:t>
-      </w:r>
-      <w:proofErr w:type="spellEnd"/>
-      <w:r>
-        <w:t xml:space="preserve"> {</w:t>
-      </w:r>
-    </w:p>
-    <w:p>
-      <w:pPr>
-        <w:spacing w:after="0"/>
-      </w:pPr>
-      <w:r>
-        <w:t>        "</w:t>
-      </w:r>
-      <w:proofErr w:type="spellStart"/>
-      <w:r>
-        <w:t>numero_factura</w:t>
-      </w:r>
-      <w:proofErr w:type="spellEnd"/>
-      <w:r>
-        <w:t>": numero,</w:t>
+        <w:t>    return {</w:t>
+      </w:r>
+    </w:p>
+    <w:p>
+      <w:pPr>
+        <w:spacing w:after="0"/>
+      </w:pPr>
+      <w:r>
+        <w:t>        "numero_factura": numero,</w:t>
       </w:r>
     </w:p>
     <w:p>
@@ -3139,15 +1566,7 @@
         <w:spacing w:after="0"/>
       </w:pPr>
       <w:r>
-        <w:t>        "</w:t>
-      </w:r>
-      <w:proofErr w:type="spellStart"/>
-      <w:r>
-        <w:t>tipo_documento</w:t>
-      </w:r>
-      <w:proofErr w:type="spellEnd"/>
-      <w:r>
-        <w:t>": tipo,</w:t>
+        <w:t>        "tipo_documento": tipo,</w:t>
       </w:r>
     </w:p>
     <w:p>
@@ -3171,47 +1590,15 @@
         <w:spacing w:after="0"/>
       </w:pPr>
       <w:r>
-        <w:t>        "</w:t>
-      </w:r>
-      <w:proofErr w:type="spellStart"/>
-      <w:r>
-        <w:t>iva_total</w:t>
-      </w:r>
-      <w:proofErr w:type="spellEnd"/>
-      <w:r>
-        <w:t xml:space="preserve">": </w:t>
-      </w:r>
-      <w:proofErr w:type="spellStart"/>
-      <w:r>
-        <w:t>iva_total</w:t>
-      </w:r>
-      <w:proofErr w:type="spellEnd"/>
-      <w:r>
-        <w:t>,</w:t>
-      </w:r>
-    </w:p>
-    <w:p>
-      <w:pPr>
-        <w:spacing w:after="0"/>
-      </w:pPr>
-      <w:r>
-        <w:t>        "</w:t>
-      </w:r>
-      <w:proofErr w:type="spellStart"/>
-      <w:r>
-        <w:t>lineas</w:t>
-      </w:r>
-      <w:proofErr w:type="spellEnd"/>
-      <w:r>
-        <w:t xml:space="preserve">": </w:t>
-      </w:r>
-      <w:proofErr w:type="spellStart"/>
-      <w:r>
-        <w:t>lineas</w:t>
-      </w:r>
-      <w:proofErr w:type="spellEnd"/>
-      <w:r>
-        <w:t>,</w:t>
+        <w:t>        "iva_total": iva_total,</w:t>
+      </w:r>
+    </w:p>
+    <w:p>
+      <w:pPr>
+        <w:spacing w:after="0"/>
+      </w:pPr>
+      <w:r>
+        <w:t>        "lineas": lineas,</w:t>
       </w:r>
     </w:p>
     <w:p>

</xml_diff>